<commit_message>
fix: lock aspect ratio on compiled document images
Pandoc's docx writer sets picLocks/noChangeAspect on the picture
itself but never emits wp:cNvGraphicFramePr (schema-optional), so the
frame-level a:graphicFrameLocks that Word actually consults for
interactive corner/side-handle drag-resize never exists. Confirmed by
diffing a Pandoc-generated image against a native Word drag-and-drop
insert in the same document - only the frame-level lock differed, and
only the drag-dropped image resized locked.

lock_image_aspect_ratios() backfills the missing frame lock for every
inline picture, wired into both the document and form compiler
pipelines since they share the same Pandoc image-insertion path.

Co-Authored-By: Claude Sonnet 5 <noreply@anthropic.com>
</commit_message>
<xml_diff>
--- a/tests/STYLING_TEST_TEMPLATE.docx
+++ b/tests/STYLING_TEST_TEMPLATE.docx
@@ -3929,6 +3929,9 @@
             <wp:extent cx="6184900" cy="3092450"/>
             <wp:effectExtent b="0" l="0" r="0" t="0"/>
             <wp:docPr descr="Complete I2C Bus Topology showing nRF52832 master connected to all peripheral devices." title="" id="1" name="Picture"/>
+            <wp:cNvGraphicFramePr>
+              <a:graphicFrameLocks noChangeAspect="1"/>
+            </wp:cNvGraphicFramePr>
             <a:graphic>
               <a:graphicData uri="http://schemas.openxmlformats.org/drawingml/2006/picture">
                 <pic:pic>
@@ -4053,6 +4056,9 @@
             <wp:extent cx="6184900" cy="3092450"/>
             <wp:effectExtent b="0" l="0" r="0" t="0"/>
             <wp:docPr descr="CPLD Interface Architecture via PCA9534 GPIO extenders." title="" id="2" name="Picture"/>
+            <wp:cNvGraphicFramePr>
+              <a:graphicFrameLocks noChangeAspect="1"/>
+            </wp:cNvGraphicFramePr>
             <a:graphic>
               <a:graphicData uri="http://schemas.openxmlformats.org/drawingml/2006/picture">
                 <pic:pic>
@@ -15748,7 +15754,7 @@
     </w:lvl>
   </w:abstractNum>
   <w:abstractNum w:abstractNumId="69">
-    <w:nsid w:val="01AC5A5C"/>
+    <w:nsid w:val="007104C6"/>
     <w:multiLevelType w:val="multilevel"/>
     <w:lvl w:ilvl="0">
       <w:numFmt w:val="bullet"/>
@@ -15851,7 +15857,7 @@
     </w:lvl>
   </w:abstractNum>
   <w:abstractNum w:abstractNumId="70">
-    <w:nsid w:val="006F431F"/>
+    <w:nsid w:val="02D69168"/>
     <w:multiLevelType w:val="multilevel"/>
     <w:lvl w:ilvl="0">
       <w:start w:val="1"/>
@@ -15936,7 +15942,7 @@
     </w:lvl>
   </w:abstractNum>
   <w:abstractNum w:abstractNumId="71">
-    <w:nsid w:val="02EFE784"/>
+    <w:nsid w:val="04A46AB3"/>
     <w:multiLevelType w:val="multilevel"/>
     <w:lvl w:ilvl="0">
       <w:start w:val="1"/>
@@ -16021,7 +16027,7 @@
     </w:lvl>
   </w:abstractNum>
   <w:abstractNum w:abstractNumId="72">
-    <w:nsid w:val="016CC823"/>
+    <w:nsid w:val="00671165"/>
     <w:multiLevelType w:val="multilevel"/>
     <w:lvl w:ilvl="0">
       <w:numFmt w:val="bullet"/>

</xml_diff>

<commit_message>
feat: support extended prototype revision numbers (e.g. 02-A)
Widen the revision table's REV # column and generalize the extractor's
digit-only revision regexes so values combining a major number with an
alphabetic prototype suffix round-trip correctly through compile and
re-extraction. Update STYLING_TEST_TEMPLATE to use the official (01)
and prototype (02-A) revision formats in place of 1.0/1.1.

Co-Authored-By: Claude Sonnet 5 <noreply@anthropic.com>
</commit_message>
<xml_diff>
--- a/tests/STYLING_TEST_TEMPLATE.docx
+++ b/tests/STYLING_TEST_TEMPLATE.docx
@@ -323,8 +323,8 @@
         <w:tblLook w:firstColumn="1" w:firstRow="1" w:lastColumn="0" w:lastRow="0" w:noHBand="0" w:noVBand="1" w:val="04A0"/>
       </w:tblPr>
       <w:tblGrid>
-        <w:gridCol w:w="805"/>
-        <w:gridCol w:w="5786"/>
+        <w:gridCol w:w="1150"/>
+        <w:gridCol w:w="5441"/>
         <w:gridCol w:w="1620"/>
         <w:gridCol w:w="1535"/>
       </w:tblGrid>
@@ -352,7 +352,7 @@
       <w:tr>
         <w:tc>
           <w:tcPr>
-            <w:tcW w:type="dxa" w:w="805"/>
+            <w:tcW w:type="dxa" w:w="1150"/>
             <w:shd w:fill="C0C0C0"/>
           </w:tcPr>
           <w:p>
@@ -370,7 +370,7 @@
         </w:tc>
         <w:tc>
           <w:tcPr>
-            <w:tcW w:type="dxa" w:w="5786"/>
+            <w:tcW w:type="dxa" w:w="5441"/>
             <w:shd w:fill="C0C0C0"/>
           </w:tcPr>
           <w:p>
@@ -426,20 +426,20 @@
       <w:tr>
         <w:tc>
           <w:tcPr>
-            <w:tcW w:type="dxa" w:w="805"/>
+            <w:tcW w:type="dxa" w:w="1150"/>
           </w:tcPr>
           <w:p>
             <w:pPr>
               <w:jc w:val="center"/>
             </w:pPr>
             <w:r>
-              <w:t>1.0</w:t>
+              <w:t>01</w:t>
             </w:r>
           </w:p>
         </w:tc>
         <w:tc>
           <w:tcPr>
-            <w:tcW w:type="dxa" w:w="5786"/>
+            <w:tcW w:type="dxa" w:w="5441"/>
           </w:tcPr>
           <w:p>
             <w:r>
@@ -477,20 +477,20 @@
       <w:tr>
         <w:tc>
           <w:tcPr>
-            <w:tcW w:type="dxa" w:w="805"/>
+            <w:tcW w:type="dxa" w:w="1150"/>
           </w:tcPr>
           <w:p>
             <w:pPr>
               <w:jc w:val="center"/>
             </w:pPr>
             <w:r>
-              <w:t>1.1</w:t>
+              <w:t>02-A</w:t>
             </w:r>
           </w:p>
         </w:tc>
         <w:tc>
           <w:tcPr>
-            <w:tcW w:type="dxa" w:w="5786"/>
+            <w:tcW w:type="dxa" w:w="5441"/>
           </w:tcPr>
           <w:p>
             <w:r>
@@ -6178,9 +6178,7 @@
     </w:p>
     <w:p>
       <w:r>
-        <w:pict>
-          <v:rect style="width:0;height:1.5pt" o:hralign="center" o:hrstd="t" o:hr="t"/>
-        </w:pict>
+        <w:br w:type="page"/>
       </w:r>
     </w:p>
     <w:p>
@@ -6193,9 +6191,7 @@
     </w:p>
     <w:p>
       <w:r>
-        <w:pict>
-          <v:rect style="width:0;height:1.5pt" o:hralign="center" o:hrstd="t" o:hr="t"/>
-        </w:pict>
+        <w:br w:type="page"/>
       </w:r>
     </w:p>
     <w:bookmarkEnd w:id="63"/>
@@ -7196,7 +7192,7 @@
               <w:jc w:val="center"/>
             </w:pPr>
             <w:r>
-              <w:t xml:space="preserve">1.0</w:t>
+              <w:t xml:space="preserve">01</w:t>
             </w:r>
           </w:p>
         </w:tc>
@@ -7245,7 +7241,7 @@
               <w:jc w:val="center"/>
             </w:pPr>
             <w:r>
-              <w:t xml:space="preserve">1.1</w:t>
+              <w:t xml:space="preserve">02-A</w:t>
             </w:r>
           </w:p>
         </w:tc>
@@ -8735,9 +8731,7 @@
     </w:p>
     <w:p>
       <w:r>
-        <w:pict>
-          <v:rect style="width:0;height:1.5pt" o:hralign="center" o:hrstd="t" o:hr="t"/>
-        </w:pict>
+        <w:br w:type="page"/>
       </w:r>
     </w:p>
     <w:p>
@@ -8752,7 +8746,7 @@
         <w:t xml:space="preserve">Document Version</w:t>
       </w:r>
       <w:r>
-        <w:t xml:space="preserve">: 1.1</w:t>
+        <w:t xml:space="preserve">: 02-A</w:t>
       </w:r>
       <w:r>
         <w:t xml:space="preserve"> </w:t>
@@ -8870,7 +8864,7 @@
             <w:jc w:val="left"/>
           </w:pPr>
           <w:r>
-            <w:t>DD_NAV3_TEST_001 Rev 1.1</w:t>
+            <w:t>DD_NAV3_TEST_001 Rev 02-A</w:t>
           </w:r>
         </w:p>
       </w:tc>
@@ -9145,7 +9139,7 @@
             <w:rPr>
               <w:b/>
             </w:rPr>
-            <w:t>Rev 1.1</w:t>
+            <w:t>Rev 02-A</w:t>
           </w:r>
         </w:p>
       </w:tc>
@@ -15754,7 +15748,7 @@
     </w:lvl>
   </w:abstractNum>
   <w:abstractNum w:abstractNumId="69">
-    <w:nsid w:val="007104C6"/>
+    <w:nsid w:val="01D1C3E8"/>
     <w:multiLevelType w:val="multilevel"/>
     <w:lvl w:ilvl="0">
       <w:numFmt w:val="bullet"/>
@@ -15857,7 +15851,7 @@
     </w:lvl>
   </w:abstractNum>
   <w:abstractNum w:abstractNumId="70">
-    <w:nsid w:val="02D69168"/>
+    <w:nsid w:val="01566718"/>
     <w:multiLevelType w:val="multilevel"/>
     <w:lvl w:ilvl="0">
       <w:start w:val="1"/>
@@ -15942,7 +15936,7 @@
     </w:lvl>
   </w:abstractNum>
   <w:abstractNum w:abstractNumId="71">
-    <w:nsid w:val="04A46AB3"/>
+    <w:nsid w:val="04E9BD6B"/>
     <w:multiLevelType w:val="multilevel"/>
     <w:lvl w:ilvl="0">
       <w:start w:val="1"/>
@@ -16027,7 +16021,7 @@
     </w:lvl>
   </w:abstractNum>
   <w:abstractNum w:abstractNumId="72">
-    <w:nsid w:val="00671165"/>
+    <w:nsid w:val="0343B767"/>
     <w:multiLevelType w:val="multilevel"/>
     <w:lvl w:ilvl="0">
       <w:numFmt w:val="bullet"/>

</xml_diff>